<commit_message>
Nop bai lab 1
</commit_message>
<xml_diff>
--- a/Slot2/Lab1_DE200002_NguyenDucHai.docx
+++ b/Slot2/Lab1_DE200002_NguyenDucHai.docx
@@ -1069,7 +1069,7 @@
             <w:noProof/>
             <w:webHidden/>
           </w:rPr>
-          <w:t>3</w:t>
+          <w:t>4</w:t>
         </w:r>
         <w:r>
           <w:rPr>
@@ -1156,7 +1156,7 @@
             <w:noProof/>
             <w:webHidden/>
           </w:rPr>
-          <w:t>3</w:t>
+          <w:t>4</w:t>
         </w:r>
         <w:r>
           <w:rPr>
@@ -1243,7 +1243,7 @@
             <w:noProof/>
             <w:webHidden/>
           </w:rPr>
-          <w:t>3</w:t>
+          <w:t>4</w:t>
         </w:r>
         <w:r>
           <w:rPr>
@@ -1330,7 +1330,7 @@
             <w:noProof/>
             <w:webHidden/>
           </w:rPr>
-          <w:t>3</w:t>
+          <w:t>4</w:t>
         </w:r>
         <w:r>
           <w:rPr>
@@ -1417,7 +1417,7 @@
             <w:noProof/>
             <w:webHidden/>
           </w:rPr>
-          <w:t>3</w:t>
+          <w:t>4</w:t>
         </w:r>
         <w:r>
           <w:rPr>
@@ -1504,7 +1504,7 @@
             <w:noProof/>
             <w:webHidden/>
           </w:rPr>
-          <w:t>3</w:t>
+          <w:t>4</w:t>
         </w:r>
         <w:r>
           <w:rPr>
@@ -1591,7 +1591,7 @@
             <w:noProof/>
             <w:webHidden/>
           </w:rPr>
-          <w:t>3</w:t>
+          <w:t>5</w:t>
         </w:r>
         <w:r>
           <w:rPr>
@@ -1678,7 +1678,7 @@
             <w:noProof/>
             <w:webHidden/>
           </w:rPr>
-          <w:t>4</w:t>
+          <w:t>5</w:t>
         </w:r>
         <w:r>
           <w:rPr>
@@ -1765,7 +1765,7 @@
             <w:noProof/>
             <w:webHidden/>
           </w:rPr>
-          <w:t>4</w:t>
+          <w:t>5</w:t>
         </w:r>
         <w:r>
           <w:rPr>
@@ -1852,7 +1852,7 @@
             <w:noProof/>
             <w:webHidden/>
           </w:rPr>
-          <w:t>4</w:t>
+          <w:t>5</w:t>
         </w:r>
         <w:r>
           <w:rPr>
@@ -1939,7 +1939,7 @@
             <w:noProof/>
             <w:webHidden/>
           </w:rPr>
-          <w:t>4</w:t>
+          <w:t>5</w:t>
         </w:r>
         <w:r>
           <w:rPr>
@@ -2026,7 +2026,7 @@
             <w:noProof/>
             <w:webHidden/>
           </w:rPr>
-          <w:t>4</w:t>
+          <w:t>6</w:t>
         </w:r>
         <w:r>
           <w:rPr>
@@ -2113,7 +2113,7 @@
             <w:noProof/>
             <w:webHidden/>
           </w:rPr>
-          <w:t>4</w:t>
+          <w:t>6</w:t>
         </w:r>
         <w:r>
           <w:rPr>
@@ -2200,7 +2200,7 @@
             <w:noProof/>
             <w:webHidden/>
           </w:rPr>
-          <w:t>5</w:t>
+          <w:t>6</w:t>
         </w:r>
         <w:r>
           <w:rPr>
@@ -2287,7 +2287,7 @@
             <w:noProof/>
             <w:webHidden/>
           </w:rPr>
-          <w:t>5</w:t>
+          <w:t>6</w:t>
         </w:r>
         <w:r>
           <w:rPr>
@@ -2374,7 +2374,7 @@
             <w:noProof/>
             <w:webHidden/>
           </w:rPr>
-          <w:t>6</w:t>
+          <w:t>7</w:t>
         </w:r>
         <w:r>
           <w:rPr>
@@ -2461,7 +2461,7 @@
             <w:noProof/>
             <w:webHidden/>
           </w:rPr>
-          <w:t>8</w:t>
+          <w:t>9</w:t>
         </w:r>
         <w:r>
           <w:rPr>
@@ -2548,7 +2548,7 @@
             <w:noProof/>
             <w:webHidden/>
           </w:rPr>
-          <w:t>8</w:t>
+          <w:t>11</w:t>
         </w:r>
         <w:r>
           <w:rPr>
@@ -2635,7 +2635,7 @@
             <w:noProof/>
             <w:webHidden/>
           </w:rPr>
-          <w:t>8</w:t>
+          <w:t>12</w:t>
         </w:r>
         <w:r>
           <w:rPr>
@@ -2877,6 +2877,21 @@
     </w:p>
     <w:p>
       <w:pPr>
+        <w:pStyle w:val="0NoiDung"/>
+        <w:numPr>
+          <w:ilvl w:val="0"/>
+          <w:numId w:val="23"/>
+        </w:numPr>
+      </w:pPr>
+      <w:r>
+        <w:t xml:space="preserve">Ví dụ: </w:t>
+      </w:r>
+      <w:r>
+        <w:t>Lập trình viên viết sai câu lệnh SQL cập nhật trạng thái ghế trong database AWS RDS.</w:t>
+      </w:r>
+    </w:p>
+    <w:p>
+      <w:pPr>
         <w:pStyle w:val="TieuDe110"/>
         <w:numPr>
           <w:ilvl w:val="2"/>
@@ -2906,6 +2921,24 @@
     </w:p>
     <w:p>
       <w:pPr>
+        <w:pStyle w:val="0NoiDung"/>
+        <w:numPr>
+          <w:ilvl w:val="0"/>
+          <w:numId w:val="22"/>
+        </w:numPr>
+        <w:rPr>
+          <w:b/>
+        </w:rPr>
+      </w:pPr>
+      <w:r>
+        <w:t xml:space="preserve">Ví dụ: </w:t>
+      </w:r>
+      <w:r>
+        <w:t>Hệ thống không khóa (lock) vị trí ghế A01 khi một hành khách đang trong bước thanh toán.</w:t>
+      </w:r>
+    </w:p>
+    <w:p>
+      <w:pPr>
         <w:pStyle w:val="TieuDe110"/>
         <w:numPr>
           <w:ilvl w:val="2"/>
@@ -2932,6 +2965,21 @@
     </w:p>
     <w:p>
       <w:pPr>
+        <w:pStyle w:val="0NoiDung"/>
+        <w:numPr>
+          <w:ilvl w:val="0"/>
+          <w:numId w:val="22"/>
+        </w:numPr>
+      </w:pPr>
+      <w:r>
+        <w:t xml:space="preserve">Ví dụ: </w:t>
+      </w:r>
+      <w:r>
+        <w:t>Hai hành khách khác nhau cùng thanh toán thành công và nhận được vé cho cùng một ghế A01 trên chuyến đi Đà Nẵng.</w:t>
+      </w:r>
+    </w:p>
+    <w:p>
+      <w:pPr>
         <w:pStyle w:val="TieuDe110"/>
         <w:numPr>
           <w:ilvl w:val="2"/>
@@ -2954,6 +3002,22 @@
       </w:pPr>
       <w:r>
         <w:t>Nguyên nhân gốc rễ tạo ra defect hoặc failure.</w:t>
+      </w:r>
+    </w:p>
+    <w:p>
+      <w:pPr>
+        <w:pStyle w:val="0NoiDung"/>
+        <w:numPr>
+          <w:ilvl w:val="0"/>
+          <w:numId w:val="22"/>
+        </w:numPr>
+      </w:pPr>
+      <w:r>
+        <w:lastRenderedPageBreak/>
+        <w:t xml:space="preserve">Ví dụ: </w:t>
+      </w:r>
+      <w:r>
+        <w:t>Lập trình viên chưa nắm rõ cách xử lý đồng bộ hóa (concurrency) trong Java Servlet khi có nhiều truy cập.</w:t>
       </w:r>
     </w:p>
     <w:p>
@@ -3190,7 +3254,6 @@
                 <w:sz w:val="20"/>
                 <w:szCs w:val="20"/>
               </w:rPr>
-              <w:lastRenderedPageBreak/>
               <w:t>Hãy định nghĩa testing. Sau đó phân biệt Testing vs Debugging, và phân biệt Verification vs Validation.</w:t>
             </w:r>
           </w:p>
@@ -3266,7 +3329,6 @@
       </w:pPr>
       <w:bookmarkStart w:id="11" w:name="_Toc230030877"/>
       <w:r>
-        <w:lastRenderedPageBreak/>
         <w:t>Câu trả lời AI</w:t>
       </w:r>
       <w:bookmarkEnd w:id="11"/>
@@ -3295,6 +3357,7 @@
         </w:numPr>
       </w:pPr>
       <w:r>
+        <w:lastRenderedPageBreak/>
         <w:t>Là quá trình p</w:t>
       </w:r>
       <w:r>
@@ -3634,7 +3697,6 @@
                 <w:sz w:val="20"/>
                 <w:szCs w:val="20"/>
               </w:rPr>
-              <w:lastRenderedPageBreak/>
               <w:t>Hãy định nghĩa ngắn gọn (dưới 30 từ) cho 3 nguyên tắc kiểm thử đầu tiên theo chuẩn ISTQB: (1) Testing shows the presence of defects, (2) Exhaustive testing is impossible, (3) Early testing saves time and money. Cho một ví dụ chung chung cho mỗi nguyên tắc.</w:t>
             </w:r>
           </w:p>
@@ -3769,7 +3831,18 @@
                 <w:sz w:val="20"/>
                 <w:szCs w:val="20"/>
               </w:rPr>
-              <w:t>Hãy giải thích nguyên tắc (6) Testing is context dependent và (7) Absence-of-defects fallacy. Lấy ví dụ áp dụng vào dự án Smart Indoor Air Quality Monitoring System (sử dụng vi điều khiển ESP32, cảm biến PM2.5 và cảnh báo qua Telegram).</w:t>
+              <w:t xml:space="preserve">Hãy giải thích nguyên tắc (6) Testing is context dependent và (7) Absence-of-defects fallacy. Lấy ví dụ áp dụng vào dự án Smart </w:t>
+            </w:r>
+            <w:r>
+              <w:rPr>
+                <w:rFonts w:ascii="Consolas" w:hAnsi="Consolas"/>
+                <w:b w:val="0"/>
+                <w:bCs/>
+                <w:sz w:val="20"/>
+                <w:szCs w:val="20"/>
+              </w:rPr>
+              <w:lastRenderedPageBreak/>
+              <w:t>Indoor Air Quality Monitoring System (sử dụng vi điều khiển ESP32, cảm biến PM2.5 và cảnh báo qua Telegram).</w:t>
             </w:r>
           </w:p>
         </w:tc>
@@ -3785,6 +3858,7 @@
       </w:pPr>
       <w:bookmarkStart w:id="18" w:name="_Toc230030884"/>
       <w:r>
+        <w:lastRenderedPageBreak/>
         <w:t>Câu trả lời của AI</w:t>
       </w:r>
       <w:bookmarkEnd w:id="18"/>
@@ -3958,7 +4032,6 @@
         </w:numPr>
       </w:pPr>
       <w:r>
-        <w:lastRenderedPageBreak/>
         <w:t>Các hệ thống khác nhau được kiểm thử theo những cách khác nhau. Không có một phương pháp kiểm thử nào áp dụng được cho mọi dự án.</w:t>
       </w:r>
     </w:p>
@@ -4066,7 +4139,11 @@
         <w:t>Nhưng khi đưa vào bối cảnh cụ thể (Fuda Bus và IoT ESP32) ở Prompt 2 và 3, AI phân tích rất trúng đích</w:t>
       </w:r>
       <w:r>
-        <w:t xml:space="preserve">. Chẳng hạn, AI hiểu được rằng test web thì chú trọng vào cơ sở dữ liệu và thanh toán, còn test phần cứng IoT thì chú trọng vào tín hiệu cảm biến và môi trường. </w:t>
+        <w:t xml:space="preserve">. </w:t>
+      </w:r>
+      <w:r>
+        <w:lastRenderedPageBreak/>
+        <w:t xml:space="preserve">Chẳng hạn, AI hiểu được rằng test web thì chú trọng vào cơ sở dữ liệu và thanh toán, còn test phần cứng IoT thì chú trọng vào tín hiệu cảm biến và môi trường. </w:t>
       </w:r>
     </w:p>
     <w:p>
@@ -4275,7 +4352,6 @@
         </w:numPr>
       </w:pPr>
       <w:r>
-        <w:lastRenderedPageBreak/>
         <w:t>Chào bạn, với tư cách là Test Manager của dự án nâng cấp hệ thống đặt vé Fuda Bus, tôi xin kể lại quá trình đội ngũ QA của chúng tôi thực hiện một chu kỳ kiểm thử chuẩn ISTQB như sau:</w:t>
       </w:r>
     </w:p>
@@ -4324,6 +4400,7 @@
         </w:numPr>
       </w:pPr>
       <w:r>
+        <w:lastRenderedPageBreak/>
         <w:t>Hoạt động này tạo ra các Test progress reports (Báo cáo tiến độ kiểm thử) giúp cập nhật tình hình liên tục cho đội ngũ quản lý và các bên liên quan</w:t>
       </w:r>
     </w:p>
@@ -4420,7 +4497,6 @@
         </w:numPr>
       </w:pPr>
       <w:r>
-        <w:lastRenderedPageBreak/>
         <w:t>Đầu ra chính yếu của giai đoạn này là tài liệu ghi nhận trạng thái test (pass, fail, blocked) và các Defect reports (Báo cáo lỗi/Bug report) khi phát hiện hệ thống hoạt động sai lệch</w:t>
       </w:r>
     </w:p>
@@ -4469,6 +4545,7 @@
         </w:numPr>
       </w:pPr>
       <w:r>
+        <w:lastRenderedPageBreak/>
         <w:t xml:space="preserve">Bằng cách yêu cầu AI sử dụng kỹ thuật nhập vai (role-play) kể chuyện, 7 hoạt động khô khan của ISTQB đã trở thành một quy trình làm việc cực kỳ sinh động </w:t>
       </w:r>
       <w:r>
@@ -4731,7 +4808,6 @@
                 <w:sz w:val="20"/>
                 <w:szCs w:val="20"/>
               </w:rPr>
-              <w:lastRenderedPageBreak/>
               <w:t>Hãy phân tích sâu 3 kỹ năng kỹ thuật (Hard skills) và 2 kỹ năng mềm (Soft skills) quan trọng nhất mà tôi cần có. Focus vào việc làm sao để tận dụng kiến thức AWS và Backend sẵn có.</w:t>
             </w:r>
           </w:p>
@@ -4790,7 +4866,6 @@
         </w:numPr>
       </w:pPr>
       <w:r>
-        <w:lastRenderedPageBreak/>
         <w:t>Câu trả lời của AI</w:t>
       </w:r>
     </w:p>
@@ -4842,6 +4917,7 @@
         <w:ind w:left="1440"/>
       </w:pPr>
       <w:r>
+        <w:lastRenderedPageBreak/>
         <w:t>AI đưa ra một danh sách rất dài nhưng khá chung chung:</w:t>
       </w:r>
     </w:p>
@@ -5045,11 +5121,7 @@
               <w:ind w:firstLine="0"/>
             </w:pPr>
             <w:r>
-              <w:t xml:space="preserve">Tận dụng hiểu biết về EC2, RDS để thiết kế kịch bản test chịu tải. Kiểm tra xem hệ thống có tự động scale-up đúng như thiết kế kiến trúc </w:t>
-            </w:r>
-            <w:r>
-              <w:lastRenderedPageBreak/>
-              <w:t>AWS khi có hàng nghìn request hay không.</w:t>
+              <w:t>Tận dụng hiểu biết về EC2, RDS để thiết kế kịch bản test chịu tải. Kiểm tra xem hệ thống có tự động scale-up đúng như thiết kế kiến trúc AWS khi có hàng nghìn request hay không.</w:t>
             </w:r>
           </w:p>
         </w:tc>
@@ -5065,7 +5137,6 @@
               <w:ind w:firstLine="0"/>
             </w:pPr>
             <w:r>
-              <w:lastRenderedPageBreak/>
               <w:t>Kỹ thuật (Hard Skill)</w:t>
             </w:r>
           </w:p>
@@ -5138,7 +5209,11 @@
               <w:ind w:firstLine="0"/>
             </w:pPr>
             <w:r>
-              <w:t>Không chỉ dừng ở việc "tìm lỗi", mà dùng tư duy kiến trúc sư hệ thống để đặt câu hỏi phản biện ngay từ lúc thiết kế bản vẽ hạ tầng: "Nếu RDS sập thì luồng dữ liệu này sẽ đi đâu?".</w:t>
+              <w:t xml:space="preserve">Không chỉ dừng ở việc "tìm lỗi", mà dùng tư duy kiến trúc sư hệ thống để đặt câu hỏi phản biện </w:t>
+            </w:r>
+            <w:r>
+              <w:lastRenderedPageBreak/>
+              <w:t>ngay từ lúc thiết kế bản vẽ hạ tầng: "Nếu RDS sập thì luồng dữ liệu này sẽ đi đâu?".</w:t>
             </w:r>
           </w:p>
         </w:tc>
@@ -5154,6 +5229,7 @@
               <w:ind w:firstLine="0"/>
             </w:pPr>
             <w:r>
+              <w:lastRenderedPageBreak/>
               <w:t>Kỹ năng mềm (Soft Skill)</w:t>
             </w:r>
           </w:p>
@@ -5212,11 +5288,7 @@
         <w:ind w:left="720"/>
       </w:pPr>
       <w:r>
-        <w:t xml:space="preserve">Thông qua nhiệm vụ này, em nhận ra vai trò của một Tester chuyên nghiệp trong năm 2026 đã vượt xa việc chỉ thao tác thủ công trên giao diện. Sự bùng nổ của điện toán đám mây đòi hỏi Tester phải có tư duy hệ thống (System Thinking). Việc nắm vững thiết kế hạ tầng mạng, triển khai máy chủ ảo hay cấu hình bảo mật không chỉ là vùng đất riêng của DevOps, mà còn là vũ khí sắc bén giúp QA thiết kế kịch bản kiểm thử hiệu năng và bảo mật chính xác hơn. Bên cạnh đó, tư duy phản biện và phương pháp tiếp cận toàn nhóm (Whole-team approach) vẫn luôn là cốt lõi. Tester xuất sắc không phải là người đi vạch lá </w:t>
-      </w:r>
-      <w:r>
-        <w:lastRenderedPageBreak/>
-        <w:t>tìm sâu, mà là một đối tác chiến lược, giao tiếp liên tục với team lập trình bằng chính ngôn ngữ kỹ thuật để ngăn chặn rủi ro ngay từ bản vẽ kiến trúc.</w:t>
+        <w:t>Thông qua nhiệm vụ này, em nhận ra vai trò của một Tester chuyên nghiệp trong năm 2026 đã vượt xa việc chỉ thao tác thủ công trên giao diện. Sự bùng nổ của điện toán đám mây đòi hỏi Tester phải có tư duy hệ thống (System Thinking). Việc nắm vững thiết kế hạ tầng mạng, triển khai máy chủ ảo hay cấu hình bảo mật không chỉ là vùng đất riêng của DevOps, mà còn là vũ khí sắc bén giúp QA thiết kế kịch bản kiểm thử hiệu năng và bảo mật chính xác hơn. Bên cạnh đó, tư duy phản biện và phương pháp tiếp cận toàn nhóm (Whole-team approach) vẫn luôn là cốt lõi. Tester xuất sắc không phải là người đi vạch lá tìm sâu, mà là một đối tác chiến lược, giao tiếp liên tục với team lập trình bằng chính ngôn ngữ kỹ thuật để ngăn chặn rủi ro ngay từ bản vẽ kiến trúc.</w:t>
       </w:r>
     </w:p>
     <w:p>
@@ -5258,7 +5330,11 @@
         <w:t xml:space="preserve"> môn IOT102</w:t>
       </w:r>
       <w:r>
-        <w:t>, em hiểu rõ hơn nguyên tắc “Testing is context dependent”, vì mỗi hệ thống sẽ có cách kiểm thử và tiêu chí đánh giá khác nhau. Ngoài ra, kiến thức về backend và điện toán đám mây mà em đang học cũng hỗ trợ rất nhiều trong việc nhìn hệ thống ở góc độ tổng thể để kiểm thử hiệu quả hơn.</w:t>
+        <w:t xml:space="preserve">, em hiểu rõ hơn nguyên tắc “Testing is context dependent”, vì mỗi hệ thống sẽ có cách kiểm thử và tiêu chí đánh giá khác nhau. Ngoài ra, kiến thức về backend </w:t>
+      </w:r>
+      <w:r>
+        <w:lastRenderedPageBreak/>
+        <w:t>và điện toán đám mây mà em đang học cũng hỗ trợ rất nhiều trong việc nhìn hệ thống ở góc độ tổng thể để kiểm thử hiệu quả hơn.</w:t>
       </w:r>
     </w:p>
     <w:p>
@@ -5273,14 +5349,6 @@
       </w:r>
       <w:r>
         <w:t>việc so sánh giữa Zero-shot và Few-shot prompting, em nhận ra AI chỉ cho ra kết quả tốt khi người dùng cung cấp đủ ngữ cảnh và yêu cầu cụ thể. Điều quan trọng nhất em học được là phải liên tục tinh chỉnh prompt và luôn kiểm tra lại câu trả lời của AI bằng các tài liệu đáng tin cậy. Nhờ đó, AI không chỉ là công cụ trả lời tự động mà còn trở thành một trợ lý hỗ trợ học tập và làm việc rất hữu ích.</w:t>
-      </w:r>
-    </w:p>
-    <w:p>
-      <w:pPr>
-        <w:pStyle w:val="0NoiDung"/>
-      </w:pPr>
-      <w:r>
-        <w:t>Thật lòng là để làm bài lab này thì em đã sài AI rất là nhiều do thứ 5 em có lịch đi thi chứng chỉ AWS nên em dồn hết nguồn lực vào để ôn thi, nhưng em cũng rất nghiêm túc học đầy đủ kiến thức lab này yêu cầu. Em cam đoan những bài lab tiếp theo sẽ làm chỉnh chu và hạn chế AI nhiều hơn.</w:t>
       </w:r>
     </w:p>
     <w:p>

</xml_diff>